<commit_message>
Add Zenodo DOI to manuscript availability files
</commit_message>
<xml_diff>
--- a/manuscript/Cover_Letter_MDPI_Sustainability_FINAL.docx
+++ b/manuscript/Cover_Letter_MDPI_Sustainability_FINAL.docx
@@ -1,6 +1,6 @@
 
 <file path=word/document.xml><?xml version="1.0" encoding="utf-8"?>
-<w:document xmlns:wpc="http://schemas.microsoft.com/office/word/2010/wordprocessingCanvas" xmlns:mo="http://schemas.microsoft.com/office/mac/office/2008/main" xmlns:mc="http://schemas.openxmlformats.org/markup-compatibility/2006" xmlns:mv="urn:schemas-microsoft-com:mac:vml" xmlns:o="urn:schemas-microsoft-com:office:office" xmlns:r="http://schemas.openxmlformats.org/officeDocument/2006/relationships" xmlns:m="http://schemas.openxmlformats.org/officeDocument/2006/math" xmlns:v="urn:schemas-microsoft-com:vml" xmlns:wp14="http://schemas.microsoft.com/office/word/2010/wordprocessingDrawing" xmlns:wp="http://schemas.openxmlformats.org/drawingml/2006/wordprocessingDrawing" xmlns:w10="urn:schemas-microsoft-com:office:word" xmlns:w="http://schemas.openxmlformats.org/wordprocessingml/2006/main" xmlns:w14="http://schemas.microsoft.com/office/word/2010/wordml" xmlns:wpg="http://schemas.microsoft.com/office/word/2010/wordprocessingGroup" xmlns:wpi="http://schemas.microsoft.com/office/word/2010/wordprocessingInk" xmlns:wne="http://schemas.microsoft.com/office/word/2006/wordml" xmlns:wps="http://schemas.microsoft.com/office/word/2010/wordprocessingShape" mc:Ignorable="w14 wp14">
+<w:document xmlns:ns1="http://schemas.openxmlformats.org/markup-compatibility/2006" xmlns:w="http://schemas.openxmlformats.org/wordprocessingml/2006/main" ns1:Ignorable="w14 wp14">
   <w:body>
     <w:p>
       <w:pPr>
@@ -46,7 +46,7 @@
     </w:p>
     <w:p>
       <w:r>
-        <w:t>We confirm that this manuscript and all parts of its content are neither published elsewhere nor under consideration by another journal. All authors have approved the manuscript and agree with its submission to Sustainability. The authors declare no conflicts of interest. Raw SWAA data are not redistributed; the code package records the data release, file hash, and reproduction command.</w:t>
+        <w:t>We confirm that this manuscript and all parts of its content are neither published elsewhere nor under consideration by another journal. All authors have approved the manuscript and agree with its submission to Sustainability. The authors declare no conflicts of interest. Raw SWAA data are not redistributed; the code package records the data release, file hash, and reproduction command. The public code repository is available at https://github.com/ZidongZhou/hybrid-misfit and the archived release is available on Zenodo at https://doi.org/10.5281/zenodo.21323412.</w:t>
       </w:r>
     </w:p>
     <w:p>

</xml_diff>